<commit_message>
this is some change
</commit_message>
<xml_diff>
--- a/wdd231_document_progressReportTemplate.docx
+++ b/wdd231_document_progressReportTemplate.docx
@@ -26,7 +26,7 @@
     </w:p>
     <w:p>
       <w:pPr>
-        <w:pStyle w:val="Body"/>
+        <w:pStyle w:val="Body A"/>
         <w:spacing w:before="200" w:after="200"/>
         <w:rPr>
           <w:sz w:val="10"/>
@@ -64,7 +64,7 @@
     </w:p>
     <w:p>
       <w:pPr>
-        <w:pStyle w:val="Body"/>
+        <w:pStyle w:val="Body A"/>
       </w:pPr>
       <w:r>
         <mc:AlternateContent>
@@ -116,7 +116,7 @@
     </w:p>
     <w:p>
       <w:pPr>
-        <w:pStyle w:val="Body"/>
+        <w:pStyle w:val="Body A"/>
         <w:spacing w:before="200" w:after="200"/>
       </w:pPr>
       <w:r>
@@ -131,7 +131,7 @@
       <w:tblPr>
         <w:tblW w:w="10800" w:type="dxa"/>
         <w:jc w:val="left"/>
-        <w:tblInd w:w="108" w:type="dxa"/>
+        <w:tblInd w:w="216" w:type="dxa"/>
         <w:tblBorders>
           <w:top w:val="single" w:color="ffffff" w:sz="8" w:space="0" w:shadow="0" w:frame="0"/>
           <w:left w:val="single" w:color="ffffff" w:sz="8" w:space="0" w:shadow="0" w:frame="0"/>
@@ -152,7 +152,7 @@
           <w:shd w:val="clear" w:color="auto" w:fill="ced7e7"/>
         </w:tblPrEx>
         <w:trPr>
-          <w:trHeight w:val="253" w:hRule="atLeast"/>
+          <w:trHeight w:val="273" w:hRule="atLeast"/>
         </w:trPr>
         <w:tc>
           <w:tcPr>
@@ -174,7 +174,7 @@
           </w:tcPr>
           <w:p>
             <w:pPr>
-              <w:pStyle w:val="Body"/>
+              <w:pStyle w:val="Body A"/>
               <w:widowControl w:val="0"/>
               <w:spacing w:line="240" w:lineRule="auto"/>
             </w:pPr>
@@ -210,7 +210,7 @@
           </w:tcPr>
           <w:p>
             <w:pPr>
-              <w:pStyle w:val="Body"/>
+              <w:pStyle w:val="Body A"/>
               <w:widowControl w:val="0"/>
               <w:spacing w:line="240" w:lineRule="auto"/>
             </w:pPr>
@@ -223,10 +223,6 @@
                 <w:shd w:val="nil" w:color="auto" w:fill="auto"/>
                 <w:rtl w:val="0"/>
                 <w:lang w:val="en-US"/>
-                <w14:textOutline w14:w="12700" w14:cap="flat">
-                  <w14:noFill/>
-                  <w14:miter w14:lim="400000"/>
-                </w14:textOutline>
               </w:rPr>
               <w:t>Joshua Rushton &amp; Dalin Stone</w:t>
             </w:r>
@@ -236,7 +232,15 @@
     </w:tbl>
     <w:p>
       <w:pPr>
-        <w:pStyle w:val="Body"/>
+        <w:pStyle w:val="Body A"/>
+        <w:widowControl w:val="0"/>
+        <w:spacing w:before="200" w:after="200" w:line="240" w:lineRule="auto"/>
+        <w:ind w:left="108" w:hanging="108"/>
+      </w:pPr>
+    </w:p>
+    <w:p>
+      <w:pPr>
+        <w:pStyle w:val="Body A"/>
         <w:widowControl w:val="0"/>
         <w:spacing w:before="200" w:after="200" w:line="240" w:lineRule="auto"/>
       </w:pPr>
@@ -265,7 +269,7 @@
     </w:p>
     <w:p>
       <w:pPr>
-        <w:pStyle w:val="Body"/>
+        <w:pStyle w:val="Body A"/>
       </w:pPr>
       <w:r>
         <mc:AlternateContent>
@@ -317,7 +321,7 @@
     </w:p>
     <w:p>
       <w:pPr>
-        <w:pStyle w:val="Body"/>
+        <w:pStyle w:val="Body A"/>
         <w:spacing w:before="200" w:after="200"/>
       </w:pPr>
       <w:r>
@@ -332,7 +336,7 @@
       <w:tblPr>
         <w:tblW w:w="10800" w:type="dxa"/>
         <w:jc w:val="left"/>
-        <w:tblInd w:w="108" w:type="dxa"/>
+        <w:tblInd w:w="216" w:type="dxa"/>
         <w:tblBorders>
           <w:top w:val="single" w:color="ffffff" w:sz="8" w:space="0" w:shadow="0" w:frame="0"/>
           <w:left w:val="single" w:color="ffffff" w:sz="8" w:space="0" w:shadow="0" w:frame="0"/>
@@ -353,7 +357,7 @@
           <w:shd w:val="clear" w:color="auto" w:fill="ced7e7"/>
         </w:tblPrEx>
         <w:trPr>
-          <w:trHeight w:val="1998" w:hRule="atLeast"/>
+          <w:trHeight w:val="2018" w:hRule="atLeast"/>
         </w:trPr>
         <w:tc>
           <w:tcPr>
@@ -375,7 +379,7 @@
           </w:tcPr>
           <w:p>
             <w:pPr>
-              <w:pStyle w:val="Body"/>
+              <w:pStyle w:val="Body A"/>
               <w:widowControl w:val="0"/>
               <w:spacing w:line="240" w:lineRule="auto"/>
             </w:pPr>
@@ -411,7 +415,7 @@
           </w:tcPr>
           <w:p>
             <w:pPr>
-              <w:pStyle w:val="Body"/>
+              <w:pStyle w:val="Body A"/>
               <w:widowControl w:val="0"/>
               <w:rPr>
                 <w:shd w:val="nil" w:color="auto" w:fill="auto"/>
@@ -426,17 +430,13 @@
                 <w:shd w:val="nil" w:color="auto" w:fill="auto"/>
                 <w:rtl w:val="0"/>
                 <w:lang w:val="en-US"/>
-                <w14:textOutline w14:w="12700" w14:cap="flat">
-                  <w14:noFill/>
-                  <w14:miter w14:lim="400000"/>
-                </w14:textOutline>
               </w:rPr>
               <w:t>The "Inflation Time Machine". The purpose of this project is to allow a</w:t>
             </w:r>
           </w:p>
           <w:p>
             <w:pPr>
-              <w:pStyle w:val="Body"/>
+              <w:pStyle w:val="Body A"/>
               <w:widowControl w:val="0"/>
               <w:bidi w:val="0"/>
               <w:ind w:left="0" w:right="0" w:firstLine="0"/>
@@ -455,17 +455,13 @@
                 <w:shd w:val="nil" w:color="auto" w:fill="auto"/>
                 <w:rtl w:val="0"/>
                 <w:lang w:val="en-US"/>
-                <w14:textOutline w14:w="12700" w14:cap="flat">
-                  <w14:noFill/>
-                  <w14:miter w14:lim="400000"/>
-                </w14:textOutline>
               </w:rPr>
               <w:t>user to input a start and end date and a amount. After clicking submit</w:t>
             </w:r>
           </w:p>
           <w:p>
             <w:pPr>
-              <w:pStyle w:val="Body"/>
+              <w:pStyle w:val="Body A"/>
               <w:widowControl w:val="0"/>
               <w:bidi w:val="0"/>
               <w:ind w:left="0" w:right="0" w:firstLine="0"/>
@@ -484,17 +480,13 @@
                 <w:shd w:val="nil" w:color="auto" w:fill="auto"/>
                 <w:rtl w:val="0"/>
                 <w:lang w:val="en-US"/>
-                <w14:textOutline w14:w="12700" w14:cap="flat">
-                  <w14:noFill/>
-                  <w14:miter w14:lim="400000"/>
-                </w14:textOutline>
               </w:rPr>
               <w:t>this should show the user how much that amount would be worth in the end</w:t>
             </w:r>
           </w:p>
           <w:p>
             <w:pPr>
-              <w:pStyle w:val="Body"/>
+              <w:pStyle w:val="Body A"/>
               <w:widowControl w:val="0"/>
               <w:bidi w:val="0"/>
               <w:ind w:left="0" w:right="0" w:firstLine="0"/>
@@ -513,17 +505,13 @@
                 <w:shd w:val="nil" w:color="auto" w:fill="auto"/>
                 <w:rtl w:val="0"/>
                 <w:lang w:val="en-US"/>
-                <w14:textOutline w14:w="12700" w14:cap="flat">
-                  <w14:noFill/>
-                  <w14:miter w14:lim="400000"/>
-                </w14:textOutline>
               </w:rPr>
               <w:t>year. Then we also give the option to the user to see how much of some</w:t>
             </w:r>
           </w:p>
           <w:p>
             <w:pPr>
-              <w:pStyle w:val="Body"/>
+              <w:pStyle w:val="Body A"/>
               <w:widowControl w:val="0"/>
               <w:bidi w:val="0"/>
               <w:ind w:left="0" w:right="0" w:firstLine="0"/>
@@ -542,17 +530,13 @@
                 <w:shd w:val="nil" w:color="auto" w:fill="auto"/>
                 <w:rtl w:val="0"/>
                 <w:lang w:val="en-US"/>
-                <w14:textOutline w14:w="12700" w14:cap="flat">
-                  <w14:noFill/>
-                  <w14:miter w14:lim="400000"/>
-                </w14:textOutline>
               </w:rPr>
               <w:t>item they could purchase with that amount today. Example: I want to see</w:t>
             </w:r>
           </w:p>
           <w:p>
             <w:pPr>
-              <w:pStyle w:val="Body"/>
+              <w:pStyle w:val="Body A"/>
               <w:widowControl w:val="0"/>
               <w:bidi w:val="0"/>
               <w:ind w:left="0" w:right="0" w:firstLine="0"/>
@@ -571,17 +555,13 @@
                 <w:shd w:val="nil" w:color="auto" w:fill="auto"/>
                 <w:rtl w:val="0"/>
                 <w:lang w:val="en-US"/>
-                <w14:textOutline w14:w="12700" w14:cap="flat">
-                  <w14:noFill/>
-                  <w14:miter w14:lim="400000"/>
-                </w14:textOutline>
               </w:rPr>
               <w:t>how much $10k from 1920 is worth today and I can see that if it is worth</w:t>
             </w:r>
           </w:p>
           <w:p>
             <w:pPr>
-              <w:pStyle w:val="Body"/>
+              <w:pStyle w:val="Body A"/>
               <w:widowControl w:val="0"/>
               <w:bidi w:val="0"/>
               <w:ind w:left="0" w:right="0" w:firstLine="0"/>
@@ -600,17 +580,13 @@
                 <w:shd w:val="nil" w:color="auto" w:fill="auto"/>
                 <w:rtl w:val="0"/>
                 <w:lang w:val="en-US"/>
-                <w14:textOutline w14:w="12700" w14:cap="flat">
-                  <w14:noFill/>
-                  <w14:miter w14:lim="400000"/>
-                </w14:textOutline>
               </w:rPr>
               <w:t>$20k today then I could buy X-number of Toyota Camry's, Houses,</w:t>
             </w:r>
           </w:p>
           <w:p>
             <w:pPr>
-              <w:pStyle w:val="Body"/>
+              <w:pStyle w:val="Body A"/>
               <w:widowControl w:val="0"/>
               <w:bidi w:val="0"/>
               <w:spacing w:line="240" w:lineRule="auto"/>
@@ -629,10 +605,6 @@
                 <w:shd w:val="nil" w:color="auto" w:fill="auto"/>
                 <w:rtl w:val="0"/>
                 <w:lang w:val="en-US"/>
-                <w14:textOutline w14:w="12700" w14:cap="flat">
-                  <w14:noFill/>
-                  <w14:miter w14:lim="400000"/>
-                </w14:textOutline>
               </w:rPr>
               <w:t>Burritos.</w:t>
             </w:r>
@@ -644,7 +616,7 @@
           <w:shd w:val="clear" w:color="auto" w:fill="ced7e7"/>
         </w:tblPrEx>
         <w:trPr>
-          <w:trHeight w:val="673" w:hRule="atLeast"/>
+          <w:trHeight w:val="693" w:hRule="atLeast"/>
         </w:trPr>
         <w:tc>
           <w:tcPr>
@@ -666,7 +638,7 @@
           </w:tcPr>
           <w:p>
             <w:pPr>
-              <w:pStyle w:val="Body"/>
+              <w:pStyle w:val="Body A"/>
               <w:widowControl w:val="0"/>
               <w:spacing w:line="240" w:lineRule="auto"/>
             </w:pPr>
@@ -702,7 +674,7 @@
           </w:tcPr>
           <w:p>
             <w:pPr>
-              <w:pStyle w:val="Body"/>
+              <w:pStyle w:val="Body A"/>
               <w:widowControl w:val="0"/>
               <w:spacing w:line="240" w:lineRule="auto"/>
             </w:pPr>
@@ -715,10 +687,6 @@
                 <w:shd w:val="nil" w:color="auto" w:fill="auto"/>
                 <w:rtl w:val="0"/>
                 <w:lang w:val="en-US"/>
-                <w14:textOutline w14:w="12700" w14:cap="flat">
-                  <w14:noFill/>
-                  <w14:miter w14:lim="400000"/>
-                </w14:textOutline>
               </w:rPr>
               <w:t>Users wanting to understand how much something is worth today based off of inflation rates and standard appreciation/depreciation of the underlying asset</w:t>
             </w:r>
@@ -730,7 +698,7 @@
           <w:shd w:val="clear" w:color="auto" w:fill="ced7e7"/>
         </w:tblPrEx>
         <w:trPr>
-          <w:trHeight w:val="493" w:hRule="atLeast"/>
+          <w:trHeight w:val="513" w:hRule="atLeast"/>
         </w:trPr>
         <w:tc>
           <w:tcPr>
@@ -752,7 +720,7 @@
           </w:tcPr>
           <w:p>
             <w:pPr>
-              <w:pStyle w:val="Body"/>
+              <w:pStyle w:val="Body A"/>
               <w:widowControl w:val="0"/>
               <w:spacing w:line="240" w:lineRule="auto"/>
             </w:pPr>
@@ -788,404 +756,126 @@
           </w:tcPr>
           <w:p>
             <w:pPr>
-              <w:keepNext w:val="0"/>
-              <w:keepLines w:val="0"/>
-              <w:pageBreakBefore w:val="0"/>
-              <w:widowControl w:val="0"/>
-              <w:shd w:val="clear" w:color="auto" w:fill="auto"/>
-              <w:suppressAutoHyphens w:val="0"/>
+              <w:pStyle w:val="Body"/>
+              <w:widowControl w:val="0"/>
+              <w:rPr>
+                <w:rStyle w:val="None"/>
+                <w:rFonts w:ascii="Arial" w:cs="Arial" w:hAnsi="Arial" w:eastAsia="Arial"/>
+                <w:sz w:val="22"/>
+                <w:szCs w:val="22"/>
+                <w:shd w:val="nil" w:color="auto" w:fill="auto"/>
+                <w14:textOutline w14:w="12700" w14:cap="flat">
+                  <w14:noFill/>
+                  <w14:miter w14:lim="400000"/>
+                </w14:textOutline>
+              </w:rPr>
+            </w:pPr>
+            <w:r>
+              <w:rPr>
+                <w:rStyle w:val="Hyperlink.0"/>
+                <w:rFonts w:ascii="Arial" w:cs="Arial" w:hAnsi="Arial" w:eastAsia="Arial"/>
+                <w:sz w:val="22"/>
+                <w:szCs w:val="22"/>
+                <w14:textOutline w14:w="12700" w14:cap="flat">
+                  <w14:noFill/>
+                  <w14:miter w14:lim="400000"/>
+                </w14:textOutline>
+              </w:rPr>
+              <w:fldChar w:fldCharType="begin" w:fldLock="0"/>
+            </w:r>
+            <w:r>
+              <w:rPr>
+                <w:rStyle w:val="Hyperlink.0"/>
+                <w:rFonts w:ascii="Arial" w:cs="Arial" w:hAnsi="Arial" w:eastAsia="Arial"/>
+                <w:sz w:val="22"/>
+                <w:szCs w:val="22"/>
+                <w14:textOutline w14:w="12700" w14:cap="flat">
+                  <w14:noFill/>
+                  <w14:miter w14:lim="400000"/>
+                </w14:textOutline>
+              </w:rPr>
+              <w:instrText xml:space="preserve"> HYPERLINK "http://inflationtimemachine.xyz/"</w:instrText>
+            </w:r>
+            <w:r>
+              <w:rPr>
+                <w:rStyle w:val="Hyperlink.0"/>
+                <w:rFonts w:ascii="Arial" w:cs="Arial" w:hAnsi="Arial" w:eastAsia="Arial"/>
+                <w:sz w:val="22"/>
+                <w:szCs w:val="22"/>
+                <w14:textOutline w14:w="12700" w14:cap="flat">
+                  <w14:noFill/>
+                  <w14:miter w14:lim="400000"/>
+                </w14:textOutline>
+              </w:rPr>
+              <w:fldChar w:fldCharType="separate" w:fldLock="0"/>
+            </w:r>
+            <w:r>
+              <w:rPr>
+                <w:rStyle w:val="Hyperlink.0"/>
+                <w:rFonts w:ascii="Arial" w:hAnsi="Arial"/>
+                <w:sz w:val="22"/>
+                <w:szCs w:val="22"/>
+                <w:rtl w:val="0"/>
+                <w:lang w:val="de-DE"/>
+                <w14:textOutline w14:w="12700" w14:cap="flat">
+                  <w14:noFill/>
+                  <w14:miter w14:lim="400000"/>
+                </w14:textOutline>
+              </w:rPr>
+              <w:t>http://inflationtimemachine.xyz/</w:t>
+            </w:r>
+            <w:r>
+              <w:rPr>
+                <w:rFonts w:ascii="Arial" w:cs="Arial" w:hAnsi="Arial" w:eastAsia="Arial"/>
+                <w:sz w:val="22"/>
+                <w:szCs w:val="22"/>
+                <w14:textOutline w14:w="12700" w14:cap="flat">
+                  <w14:noFill/>
+                  <w14:miter w14:lim="400000"/>
+                </w14:textOutline>
+              </w:rPr>
+              <w:fldChar w:fldCharType="end" w:fldLock="0"/>
+            </w:r>
+          </w:p>
+          <w:p>
+            <w:pPr>
+              <w:pStyle w:val="Body"/>
+              <w:widowControl w:val="0"/>
               <w:bidi w:val="0"/>
-              <w:spacing w:before="0" w:after="0" w:line="240" w:lineRule="auto"/>
               <w:ind w:left="0" w:right="0" w:firstLine="0"/>
               <w:jc w:val="left"/>
-              <w:outlineLvl w:val="9"/>
-              <w:rPr>
-                <w:rFonts w:ascii="Arial" w:cs="Arial" w:hAnsi="Arial" w:eastAsia="Arial"/>
-                <w:b w:val="0"/>
-                <w:bCs w:val="0"/>
-                <w:i w:val="0"/>
-                <w:iCs w:val="0"/>
-                <w:caps w:val="0"/>
-                <w:smallCaps w:val="0"/>
-                <w:strike w:val="0"/>
-                <w:dstrike w:val="0"/>
-                <w:outline w:val="0"/>
-                <w:color w:val="000000"/>
-                <w:spacing w:val="0"/>
-                <w:kern w:val="0"/>
-                <w:position w:val="0"/>
-                <w:sz w:val="22"/>
-                <w:szCs w:val="22"/>
-                <w:u w:val="none" w:color="000000"/>
-                <w:shd w:val="nil" w:color="auto" w:fill="auto"/>
-                <w:vertAlign w:val="baseline"/>
-                <w:rtl w:val="0"/>
-                <w14:textOutline>
-                  <w14:noFill/>
-                </w14:textOutline>
-                <w14:textFill>
-                  <w14:solidFill>
-                    <w14:srgbClr w14:val="000000"/>
-                  </w14:solidFill>
-                </w14:textFill>
-              </w:rPr>
-            </w:pPr>
-            <w:r>
-              <w:rPr>
-                <w:rStyle w:val="Hyperlink.0"/>
-                <w:rFonts w:ascii="Arial" w:cs="Arial" w:hAnsi="Arial" w:eastAsia="Arial"/>
-                <w:b w:val="0"/>
-                <w:bCs w:val="0"/>
-                <w:i w:val="0"/>
-                <w:iCs w:val="0"/>
-                <w:caps w:val="0"/>
-                <w:smallCaps w:val="0"/>
-                <w:strike w:val="0"/>
-                <w:dstrike w:val="0"/>
-                <w:outline w:val="0"/>
-                <w:color w:val="0000ff"/>
-                <w:spacing w:val="0"/>
-                <w:kern w:val="0"/>
-                <w:position w:val="0"/>
-                <w:sz w:val="22"/>
-                <w:szCs w:val="22"/>
-                <w:u w:val="single" w:color="0000ff"/>
-                <w:shd w:val="nil" w:color="auto" w:fill="auto"/>
-                <w:vertAlign w:val="baseline"/>
-                <w:rtl w:val="0"/>
-                <w14:textOutline>
-                  <w14:noFill/>
-                </w14:textOutline>
-                <w14:textFill>
-                  <w14:solidFill>
-                    <w14:srgbClr w14:val="0000FF"/>
-                  </w14:solidFill>
-                </w14:textFill>
+              <w:rPr>
+                <w:rtl w:val="0"/>
+              </w:rPr>
+            </w:pPr>
+            <w:r>
+              <w:rPr>
+                <w:rStyle w:val="Hyperlink.1"/>
               </w:rPr>
               <w:fldChar w:fldCharType="begin" w:fldLock="0"/>
             </w:r>
             <w:r>
               <w:rPr>
-                <w:rStyle w:val="Hyperlink.0"/>
-                <w:rFonts w:ascii="Arial" w:cs="Arial" w:hAnsi="Arial" w:eastAsia="Arial"/>
-                <w:b w:val="0"/>
-                <w:bCs w:val="0"/>
-                <w:i w:val="0"/>
-                <w:iCs w:val="0"/>
-                <w:caps w:val="0"/>
-                <w:smallCaps w:val="0"/>
-                <w:strike w:val="0"/>
-                <w:dstrike w:val="0"/>
-                <w:outline w:val="0"/>
-                <w:color w:val="0000ff"/>
-                <w:spacing w:val="0"/>
-                <w:kern w:val="0"/>
-                <w:position w:val="0"/>
-                <w:sz w:val="22"/>
-                <w:szCs w:val="22"/>
-                <w:u w:val="single" w:color="0000ff"/>
-                <w:shd w:val="nil" w:color="auto" w:fill="auto"/>
-                <w:vertAlign w:val="baseline"/>
-                <w:rtl w:val="0"/>
-                <w14:textOutline>
-                  <w14:noFill/>
-                </w14:textOutline>
-                <w14:textFill>
-                  <w14:solidFill>
-                    <w14:srgbClr w14:val="0000FF"/>
-                  </w14:solidFill>
-                </w14:textFill>
-              </w:rPr>
-              <w:instrText xml:space="preserve"> HYPERLINK "http://inflationtimemachine.xyz/"</w:instrText>
-            </w:r>
-            <w:r>
-              <w:rPr>
-                <w:rStyle w:val="Hyperlink.0"/>
-                <w:rFonts w:ascii="Arial" w:cs="Arial" w:hAnsi="Arial" w:eastAsia="Arial"/>
-                <w:b w:val="0"/>
-                <w:bCs w:val="0"/>
-                <w:i w:val="0"/>
-                <w:iCs w:val="0"/>
-                <w:caps w:val="0"/>
-                <w:smallCaps w:val="0"/>
-                <w:strike w:val="0"/>
-                <w:dstrike w:val="0"/>
-                <w:outline w:val="0"/>
-                <w:color w:val="0000ff"/>
-                <w:spacing w:val="0"/>
-                <w:kern w:val="0"/>
-                <w:position w:val="0"/>
-                <w:sz w:val="22"/>
-                <w:szCs w:val="22"/>
-                <w:u w:val="single" w:color="0000ff"/>
-                <w:shd w:val="nil" w:color="auto" w:fill="auto"/>
-                <w:vertAlign w:val="baseline"/>
-                <w:rtl w:val="0"/>
-                <w14:textOutline>
-                  <w14:noFill/>
-                </w14:textOutline>
-                <w14:textFill>
-                  <w14:solidFill>
-                    <w14:srgbClr w14:val="0000FF"/>
-                  </w14:solidFill>
-                </w14:textFill>
+                <w:rStyle w:val="Hyperlink.1"/>
+              </w:rPr>
+              <w:instrText xml:space="preserve"> HYPERLINK "https://github.com/dalinkstone/inflationtimemachine"</w:instrText>
+            </w:r>
+            <w:r>
+              <w:rPr>
+                <w:rStyle w:val="Hyperlink.1"/>
               </w:rPr>
               <w:fldChar w:fldCharType="separate" w:fldLock="0"/>
             </w:r>
             <w:r>
               <w:rPr>
-                <w:rStyle w:val="Hyperlink.0"/>
-                <w:rFonts w:ascii="Arial" w:cs="Arial Unicode MS" w:hAnsi="Arial" w:eastAsia="Arial Unicode MS"/>
-                <w:b w:val="0"/>
-                <w:bCs w:val="0"/>
-                <w:i w:val="0"/>
-                <w:iCs w:val="0"/>
-                <w:caps w:val="0"/>
-                <w:smallCaps w:val="0"/>
-                <w:strike w:val="0"/>
-                <w:dstrike w:val="0"/>
-                <w:outline w:val="0"/>
-                <w:color w:val="0000ff"/>
-                <w:spacing w:val="0"/>
-                <w:kern w:val="0"/>
-                <w:position w:val="0"/>
-                <w:sz w:val="22"/>
-                <w:szCs w:val="22"/>
-                <w:u w:val="single" w:color="0000ff"/>
-                <w:shd w:val="nil" w:color="auto" w:fill="auto"/>
-                <w:vertAlign w:val="baseline"/>
-                <w:rtl w:val="0"/>
-                <w:lang w:val="de-DE"/>
-                <w14:textOutline>
-                  <w14:noFill/>
-                </w14:textOutline>
-                <w14:textFill>
-                  <w14:solidFill>
-                    <w14:srgbClr w14:val="0000FF"/>
-                  </w14:solidFill>
-                </w14:textFill>
-              </w:rPr>
-              <w:t>http://inflationtimemachine.xyz/</w:t>
-            </w:r>
-            <w:r>
-              <w:rPr>
-                <w:rFonts w:ascii="Arial" w:cs="Arial" w:hAnsi="Arial" w:eastAsia="Arial"/>
-                <w:b w:val="0"/>
-                <w:bCs w:val="0"/>
-                <w:i w:val="0"/>
-                <w:iCs w:val="0"/>
-                <w:caps w:val="0"/>
-                <w:smallCaps w:val="0"/>
-                <w:strike w:val="0"/>
-                <w:dstrike w:val="0"/>
-                <w:outline w:val="0"/>
-                <w:color w:val="000000"/>
-                <w:spacing w:val="0"/>
-                <w:kern w:val="0"/>
-                <w:position w:val="0"/>
-                <w:sz w:val="22"/>
-                <w:szCs w:val="22"/>
-                <w:u w:val="none" w:color="000000"/>
-                <w:shd w:val="nil" w:color="auto" w:fill="auto"/>
-                <w:vertAlign w:val="baseline"/>
-                <w:rtl w:val="0"/>
-                <w14:textOutline>
-                  <w14:noFill/>
-                </w14:textOutline>
-                <w14:textFill>
-                  <w14:solidFill>
-                    <w14:srgbClr w14:val="000000"/>
-                  </w14:solidFill>
-                </w14:textFill>
-              </w:rPr>
-              <w:fldChar w:fldCharType="end" w:fldLock="0"/>
-            </w:r>
-          </w:p>
-          <w:p>
-            <w:pPr>
-              <w:keepNext w:val="0"/>
-              <w:keepLines w:val="0"/>
-              <w:pageBreakBefore w:val="0"/>
-              <w:widowControl w:val="0"/>
-              <w:shd w:val="clear" w:color="auto" w:fill="auto"/>
-              <w:suppressAutoHyphens w:val="0"/>
-              <w:bidi w:val="0"/>
-              <w:spacing w:before="0" w:after="0" w:line="240" w:lineRule="auto"/>
-              <w:ind w:left="0" w:right="0" w:firstLine="0"/>
-              <w:jc w:val="left"/>
-              <w:outlineLvl w:val="9"/>
-              <w:rPr>
-                <w:rtl w:val="0"/>
-              </w:rPr>
-            </w:pPr>
-            <w:r>
-              <w:rPr>
-                <w:rStyle w:val="Hyperlink.0"/>
-                <w:rFonts w:ascii="Arial" w:cs="Arial" w:hAnsi="Arial" w:eastAsia="Arial"/>
-                <w:b w:val="0"/>
-                <w:bCs w:val="0"/>
-                <w:i w:val="0"/>
-                <w:iCs w:val="0"/>
-                <w:caps w:val="0"/>
-                <w:smallCaps w:val="0"/>
-                <w:strike w:val="0"/>
-                <w:dstrike w:val="0"/>
-                <w:outline w:val="0"/>
-                <w:color w:val="0000ff"/>
-                <w:spacing w:val="0"/>
-                <w:kern w:val="0"/>
-                <w:position w:val="0"/>
-                <w:sz w:val="22"/>
-                <w:szCs w:val="22"/>
-                <w:u w:val="single" w:color="0000ff"/>
-                <w:shd w:val="nil" w:color="auto" w:fill="auto"/>
-                <w:vertAlign w:val="baseline"/>
-                <w:rtl w:val="0"/>
-                <w14:textOutline>
-                  <w14:noFill/>
-                </w14:textOutline>
-                <w14:textFill>
-                  <w14:solidFill>
-                    <w14:srgbClr w14:val="0000FF"/>
-                  </w14:solidFill>
-                </w14:textFill>
-              </w:rPr>
-              <w:fldChar w:fldCharType="begin" w:fldLock="0"/>
-            </w:r>
-            <w:r>
-              <w:rPr>
-                <w:rStyle w:val="Hyperlink.0"/>
-                <w:rFonts w:ascii="Arial" w:cs="Arial" w:hAnsi="Arial" w:eastAsia="Arial"/>
-                <w:b w:val="0"/>
-                <w:bCs w:val="0"/>
-                <w:i w:val="0"/>
-                <w:iCs w:val="0"/>
-                <w:caps w:val="0"/>
-                <w:smallCaps w:val="0"/>
-                <w:strike w:val="0"/>
-                <w:dstrike w:val="0"/>
-                <w:outline w:val="0"/>
-                <w:color w:val="0000ff"/>
-                <w:spacing w:val="0"/>
-                <w:kern w:val="0"/>
-                <w:position w:val="0"/>
-                <w:sz w:val="22"/>
-                <w:szCs w:val="22"/>
-                <w:u w:val="single" w:color="0000ff"/>
-                <w:shd w:val="nil" w:color="auto" w:fill="auto"/>
-                <w:vertAlign w:val="baseline"/>
-                <w:rtl w:val="0"/>
-                <w14:textOutline>
-                  <w14:noFill/>
-                </w14:textOutline>
-                <w14:textFill>
-                  <w14:solidFill>
-                    <w14:srgbClr w14:val="0000FF"/>
-                  </w14:solidFill>
-                </w14:textFill>
-              </w:rPr>
-              <w:instrText xml:space="preserve"> HYPERLINK "https://github.com/dalinkstone/inflationtimemachine"</w:instrText>
-            </w:r>
-            <w:r>
-              <w:rPr>
-                <w:rStyle w:val="Hyperlink.0"/>
-                <w:rFonts w:ascii="Arial" w:cs="Arial" w:hAnsi="Arial" w:eastAsia="Arial"/>
-                <w:b w:val="0"/>
-                <w:bCs w:val="0"/>
-                <w:i w:val="0"/>
-                <w:iCs w:val="0"/>
-                <w:caps w:val="0"/>
-                <w:smallCaps w:val="0"/>
-                <w:strike w:val="0"/>
-                <w:dstrike w:val="0"/>
-                <w:outline w:val="0"/>
-                <w:color w:val="0000ff"/>
-                <w:spacing w:val="0"/>
-                <w:kern w:val="0"/>
-                <w:position w:val="0"/>
-                <w:sz w:val="22"/>
-                <w:szCs w:val="22"/>
-                <w:u w:val="single" w:color="0000ff"/>
-                <w:shd w:val="nil" w:color="auto" w:fill="auto"/>
-                <w:vertAlign w:val="baseline"/>
-                <w:rtl w:val="0"/>
-                <w14:textOutline>
-                  <w14:noFill/>
-                </w14:textOutline>
-                <w14:textFill>
-                  <w14:solidFill>
-                    <w14:srgbClr w14:val="0000FF"/>
-                  </w14:solidFill>
-                </w14:textFill>
-              </w:rPr>
-              <w:fldChar w:fldCharType="separate" w:fldLock="0"/>
-            </w:r>
-            <w:r>
-              <w:rPr>
-                <w:rStyle w:val="Hyperlink.0"/>
-                <w:rFonts w:ascii="Arial" w:cs="Arial Unicode MS" w:hAnsi="Arial" w:eastAsia="Arial Unicode MS"/>
-                <w:b w:val="0"/>
-                <w:bCs w:val="0"/>
-                <w:i w:val="0"/>
-                <w:iCs w:val="0"/>
-                <w:caps w:val="0"/>
-                <w:smallCaps w:val="0"/>
-                <w:strike w:val="0"/>
-                <w:dstrike w:val="0"/>
-                <w:outline w:val="0"/>
-                <w:color w:val="0000ff"/>
-                <w:spacing w:val="0"/>
-                <w:kern w:val="0"/>
-                <w:position w:val="0"/>
-                <w:sz w:val="22"/>
-                <w:szCs w:val="22"/>
-                <w:u w:val="single" w:color="0000ff"/>
-                <w:shd w:val="nil" w:color="auto" w:fill="auto"/>
-                <w:vertAlign w:val="baseline"/>
-                <w:rtl w:val="0"/>
-                <w:lang w:val="en-US"/>
-                <w14:textOutline>
-                  <w14:noFill/>
-                </w14:textOutline>
-                <w14:textFill>
-                  <w14:solidFill>
-                    <w14:srgbClr w14:val="0000FF"/>
-                  </w14:solidFill>
-                </w14:textFill>
+                <w:rStyle w:val="Hyperlink.1"/>
+                <w:rtl w:val="0"/>
+                <w:lang w:val="en-US"/>
               </w:rPr>
               <w:t>https://github.com/dalinkstone/inflationtimemachine</w:t>
             </w:r>
             <w:r>
-              <w:rPr>
-                <w:rFonts w:ascii="Arial" w:cs="Arial" w:hAnsi="Arial" w:eastAsia="Arial"/>
-                <w:b w:val="0"/>
-                <w:bCs w:val="0"/>
-                <w:i w:val="0"/>
-                <w:iCs w:val="0"/>
-                <w:caps w:val="0"/>
-                <w:smallCaps w:val="0"/>
-                <w:strike w:val="0"/>
-                <w:dstrike w:val="0"/>
-                <w:outline w:val="0"/>
-                <w:color w:val="000000"/>
-                <w:spacing w:val="0"/>
-                <w:kern w:val="0"/>
-                <w:position w:val="0"/>
-                <w:sz w:val="22"/>
-                <w:szCs w:val="22"/>
-                <w:u w:val="none" w:color="000000"/>
-                <w:shd w:val="nil" w:color="auto" w:fill="auto"/>
-                <w:vertAlign w:val="baseline"/>
-                <w:rtl w:val="0"/>
-                <w14:textOutline>
-                  <w14:noFill/>
-                </w14:textOutline>
-                <w14:textFill>
-                  <w14:solidFill>
-                    <w14:srgbClr w14:val="000000"/>
-                  </w14:solidFill>
-                </w14:textFill>
-              </w:rPr>
+              <w:rPr/>
               <w:fldChar w:fldCharType="end" w:fldLock="0"/>
             </w:r>
           </w:p>
@@ -1194,7 +884,15 @@
     </w:tbl>
     <w:p>
       <w:pPr>
-        <w:pStyle w:val="Body"/>
+        <w:pStyle w:val="Body A"/>
+        <w:widowControl w:val="0"/>
+        <w:spacing w:before="200" w:after="200" w:line="240" w:lineRule="auto"/>
+        <w:ind w:left="108" w:hanging="108"/>
+      </w:pPr>
+    </w:p>
+    <w:p>
+      <w:pPr>
+        <w:pStyle w:val="Body A"/>
         <w:widowControl w:val="0"/>
         <w:spacing w:before="200" w:after="200" w:line="240" w:lineRule="auto"/>
       </w:pPr>
@@ -1207,6 +905,7 @@
       <w:bookmarkEnd w:id="3"/>
       <w:r>
         <w:rPr>
+          <w:rStyle w:val="None"/>
           <w:rFonts w:cs="Arial Unicode MS" w:eastAsia="Arial Unicode MS"/>
           <w:rtl w:val="0"/>
         </w:rPr>
@@ -1214,6 +913,7 @@
       </w:r>
       <w:r>
         <w:rPr>
+          <w:rStyle w:val="None"/>
           <w:rFonts w:cs="Arial Unicode MS" w:eastAsia="Arial Unicode MS"/>
           <w:rtl w:val="0"/>
           <w:lang w:val="fr-FR"/>
@@ -1223,9 +923,12 @@
     </w:p>
     <w:p>
       <w:pPr>
-        <w:pStyle w:val="Body"/>
+        <w:pStyle w:val="Body A"/>
       </w:pPr>
       <w:r>
+        <w:rPr>
+          <w:rStyle w:val="None"/>
+        </w:rPr>
         <mc:AlternateContent>
           <mc:Choice Requires="wps">
             <w:drawing xmlns:a="http://schemas.openxmlformats.org/drawingml/2006/main">
@@ -1275,11 +978,12 @@
     </w:p>
     <w:p>
       <w:pPr>
-        <w:pStyle w:val="Body"/>
+        <w:pStyle w:val="Body A"/>
         <w:spacing w:before="200" w:after="200"/>
       </w:pPr>
       <w:r>
         <w:rPr>
+          <w:rStyle w:val="None"/>
           <w:rtl w:val="0"/>
           <w:lang w:val="en-US"/>
         </w:rPr>
@@ -1290,7 +994,7 @@
       <w:tblPr>
         <w:tblW w:w="10800" w:type="dxa"/>
         <w:jc w:val="left"/>
-        <w:tblInd w:w="108" w:type="dxa"/>
+        <w:tblInd w:w="216" w:type="dxa"/>
         <w:tblBorders>
           <w:top w:val="single" w:color="ffffff" w:sz="8" w:space="0" w:shadow="0" w:frame="0"/>
           <w:left w:val="single" w:color="ffffff" w:sz="8" w:space="0" w:shadow="0" w:frame="0"/>
@@ -1311,7 +1015,7 @@
           <w:shd w:val="clear" w:color="auto" w:fill="ced7e7"/>
         </w:tblPrEx>
         <w:trPr>
-          <w:trHeight w:val="253" w:hRule="atLeast"/>
+          <w:trHeight w:val="273" w:hRule="atLeast"/>
         </w:trPr>
         <w:tc>
           <w:tcPr>
@@ -1333,13 +1037,14 @@
           </w:tcPr>
           <w:p>
             <w:pPr>
-              <w:pStyle w:val="Body"/>
+              <w:pStyle w:val="Body A"/>
               <w:widowControl w:val="0"/>
               <w:spacing w:line="240" w:lineRule="auto"/>
               <w:jc w:val="center"/>
             </w:pPr>
             <w:r>
               <w:rPr>
+                <w:rStyle w:val="None"/>
                 <w:b w:val="1"/>
                 <w:bCs w:val="1"/>
                 <w:shd w:val="nil" w:color="auto" w:fill="auto"/>
@@ -1370,13 +1075,14 @@
           </w:tcPr>
           <w:p>
             <w:pPr>
-              <w:pStyle w:val="Body"/>
+              <w:pStyle w:val="Body A"/>
               <w:widowControl w:val="0"/>
               <w:spacing w:line="240" w:lineRule="auto"/>
               <w:jc w:val="center"/>
             </w:pPr>
             <w:r>
               <w:rPr>
+                <w:rStyle w:val="None"/>
                 <w:b w:val="1"/>
                 <w:bCs w:val="1"/>
                 <w:shd w:val="nil" w:color="auto" w:fill="auto"/>
@@ -1393,7 +1099,7 @@
           <w:shd w:val="clear" w:color="auto" w:fill="ced7e7"/>
         </w:tblPrEx>
         <w:trPr>
-          <w:trHeight w:val="973" w:hRule="atLeast"/>
+          <w:trHeight w:val="993" w:hRule="atLeast"/>
         </w:trPr>
         <w:tc>
           <w:tcPr>
@@ -1415,12 +1121,13 @@
           </w:tcPr>
           <w:p>
             <w:pPr>
-              <w:pStyle w:val="Body"/>
+              <w:pStyle w:val="Body A"/>
               <w:widowControl w:val="0"/>
               <w:spacing w:line="240" w:lineRule="auto"/>
             </w:pPr>
             <w:r>
               <w:rPr>
+                <w:rStyle w:val="None"/>
                 <w:shd w:val="nil" w:color="auto" w:fill="auto"/>
                 <w:rtl w:val="0"/>
                 <w:lang w:val="en-US"/>
@@ -1449,12 +1156,13 @@
           </w:tcPr>
           <w:p>
             <w:pPr>
-              <w:pStyle w:val="Body"/>
+              <w:pStyle w:val="Body A"/>
               <w:widowControl w:val="0"/>
               <w:spacing w:line="240" w:lineRule="auto"/>
             </w:pPr>
             <w:r>
               <w:rPr>
+                <w:rStyle w:val="None"/>
                 <w:shd w:val="nil" w:color="auto" w:fill="auto"/>
                 <w:rtl w:val="0"/>
                 <w:lang w:val="en-US"/>
@@ -1469,7 +1177,7 @@
           <w:shd w:val="clear" w:color="auto" w:fill="ced7e7"/>
         </w:tblPrEx>
         <w:trPr>
-          <w:trHeight w:val="733" w:hRule="atLeast"/>
+          <w:trHeight w:val="753" w:hRule="atLeast"/>
         </w:trPr>
         <w:tc>
           <w:tcPr>
@@ -1491,12 +1199,13 @@
           </w:tcPr>
           <w:p>
             <w:pPr>
-              <w:pStyle w:val="Body"/>
+              <w:pStyle w:val="Body A"/>
               <w:widowControl w:val="0"/>
               <w:spacing w:line="240" w:lineRule="auto"/>
             </w:pPr>
             <w:r>
               <w:rPr>
+                <w:rStyle w:val="None"/>
                 <w:shd w:val="nil" w:color="auto" w:fill="auto"/>
                 <w:rtl w:val="0"/>
                 <w:lang w:val="en-US"/>
@@ -1525,12 +1234,13 @@
           </w:tcPr>
           <w:p>
             <w:pPr>
-              <w:pStyle w:val="Body"/>
+              <w:pStyle w:val="Body A"/>
               <w:widowControl w:val="0"/>
               <w:spacing w:line="240" w:lineRule="auto"/>
             </w:pPr>
             <w:r>
               <w:rPr>
+                <w:rStyle w:val="None"/>
                 <w:shd w:val="nil" w:color="auto" w:fill="auto"/>
                 <w:rtl w:val="0"/>
                 <w:lang w:val="en-US"/>
@@ -1539,6 +1249,7 @@
             </w:r>
             <w:r>
               <w:rPr>
+                <w:rStyle w:val="None"/>
                 <w:shd w:val="nil" w:color="auto" w:fill="auto"/>
                 <w:rtl w:val="0"/>
                 <w:lang w:val="en-US"/>
@@ -1547,6 +1258,7 @@
             </w:r>
             <w:r>
               <w:rPr>
+                <w:rStyle w:val="None"/>
                 <w:shd w:val="nil" w:color="auto" w:fill="auto"/>
                 <w:rtl w:val="0"/>
                 <w:lang w:val="en-US"/>
@@ -1555,6 +1267,7 @@
             </w:r>
             <w:r>
               <w:rPr>
+                <w:rStyle w:val="None"/>
                 <w:shd w:val="nil" w:color="auto" w:fill="auto"/>
                 <w:rtl w:val="0"/>
                 <w:lang w:val="en-US"/>
@@ -1563,6 +1276,7 @@
             </w:r>
             <w:r>
               <w:rPr>
+                <w:rStyle w:val="None"/>
                 <w:shd w:val="nil" w:color="auto" w:fill="auto"/>
                 <w:rtl w:val="0"/>
                 <w:lang w:val="en-US"/>
@@ -1577,7 +1291,7 @@
           <w:shd w:val="clear" w:color="auto" w:fill="ced7e7"/>
         </w:tblPrEx>
         <w:trPr>
-          <w:trHeight w:val="253" w:hRule="atLeast"/>
+          <w:trHeight w:val="273" w:hRule="atLeast"/>
         </w:trPr>
         <w:tc>
           <w:tcPr>
@@ -1599,12 +1313,13 @@
           </w:tcPr>
           <w:p>
             <w:pPr>
-              <w:pStyle w:val="Body"/>
+              <w:pStyle w:val="Body A"/>
               <w:widowControl w:val="0"/>
               <w:spacing w:line="240" w:lineRule="auto"/>
             </w:pPr>
             <w:r>
               <w:rPr>
+                <w:rStyle w:val="None"/>
                 <w:shd w:val="nil" w:color="auto" w:fill="auto"/>
                 <w:rtl w:val="0"/>
                 <w:lang w:val="en-US"/>
@@ -1633,12 +1348,13 @@
           </w:tcPr>
           <w:p>
             <w:pPr>
-              <w:pStyle w:val="Body"/>
+              <w:pStyle w:val="Body A"/>
               <w:widowControl w:val="0"/>
               <w:spacing w:line="240" w:lineRule="auto"/>
             </w:pPr>
             <w:r>
               <w:rPr>
+                <w:rStyle w:val="None"/>
                 <w:shd w:val="nil" w:color="auto" w:fill="auto"/>
                 <w:rtl w:val="0"/>
                 <w:lang w:val="en-US"/>
@@ -1647,6 +1363,7 @@
             </w:r>
             <w:r>
               <w:rPr>
+                <w:rStyle w:val="None"/>
                 <w:shd w:val="nil" w:color="auto" w:fill="auto"/>
                 <w:rtl w:val="0"/>
                 <w:lang w:val="en-US"/>
@@ -1655,6 +1372,7 @@
             </w:r>
             <w:r>
               <w:rPr>
+                <w:rStyle w:val="None"/>
                 <w:shd w:val="nil" w:color="auto" w:fill="auto"/>
                 <w:rtl w:val="0"/>
                 <w:lang w:val="en-US"/>
@@ -1669,7 +1387,7 @@
           <w:shd w:val="clear" w:color="auto" w:fill="ced7e7"/>
         </w:tblPrEx>
         <w:trPr>
-          <w:trHeight w:val="493" w:hRule="atLeast"/>
+          <w:trHeight w:val="513" w:hRule="atLeast"/>
         </w:trPr>
         <w:tc>
           <w:tcPr>
@@ -1691,12 +1409,13 @@
           </w:tcPr>
           <w:p>
             <w:pPr>
-              <w:pStyle w:val="Body"/>
+              <w:pStyle w:val="Body A"/>
               <w:widowControl w:val="0"/>
               <w:spacing w:line="240" w:lineRule="auto"/>
             </w:pPr>
             <w:r>
               <w:rPr>
+                <w:rStyle w:val="None"/>
                 <w:shd w:val="nil" w:color="auto" w:fill="auto"/>
                 <w:rtl w:val="0"/>
                 <w:lang w:val="en-US"/>
@@ -1725,12 +1444,13 @@
           </w:tcPr>
           <w:p>
             <w:pPr>
-              <w:pStyle w:val="Body"/>
+              <w:pStyle w:val="Body A"/>
               <w:widowControl w:val="0"/>
               <w:spacing w:line="240" w:lineRule="auto"/>
             </w:pPr>
             <w:r>
               <w:rPr>
+                <w:rStyle w:val="None"/>
                 <w:shd w:val="nil" w:color="auto" w:fill="auto"/>
                 <w:rtl w:val="0"/>
                 <w:lang w:val="en-US"/>
@@ -1745,7 +1465,7 @@
           <w:shd w:val="clear" w:color="auto" w:fill="ced7e7"/>
         </w:tblPrEx>
         <w:trPr>
-          <w:trHeight w:val="1213" w:hRule="atLeast"/>
+          <w:trHeight w:val="1933" w:hRule="atLeast"/>
         </w:trPr>
         <w:tc>
           <w:tcPr>
@@ -1767,12 +1487,13 @@
           </w:tcPr>
           <w:p>
             <w:pPr>
-              <w:pStyle w:val="Body"/>
+              <w:pStyle w:val="Body A"/>
               <w:widowControl w:val="0"/>
               <w:spacing w:line="240" w:lineRule="auto"/>
             </w:pPr>
             <w:r>
               <w:rPr>
+                <w:rStyle w:val="None"/>
                 <w:shd w:val="nil" w:color="auto" w:fill="auto"/>
                 <w:rtl w:val="0"/>
                 <w:lang w:val="en-US"/>
@@ -1801,17 +1522,95 @@
           </w:tcPr>
           <w:p>
             <w:pPr>
-              <w:pStyle w:val="Body"/>
+              <w:pStyle w:val="Body A"/>
               <w:widowControl w:val="0"/>
               <w:spacing w:line="240" w:lineRule="auto"/>
-            </w:pPr>
-            <w:r>
-              <w:rPr>
-                <w:shd w:val="nil" w:color="auto" w:fill="auto"/>
-                <w:rtl w:val="0"/>
-                <w:lang w:val="en-US"/>
-              </w:rPr>
-              <w:t xml:space="preserve">I think it is going good for the most part, I told him I would do the html and css and he said he would mainly focus on the JavaScript, but I have asked for help on colors and images and he give me his opinion. </w:t>
+              <w:rPr>
+                <w:lang w:val="en-US"/>
+              </w:rPr>
+            </w:pPr>
+            <w:r>
+              <w:rPr>
+                <w:rtl w:val="0"/>
+                <w:lang w:val="en-US"/>
+              </w:rPr>
+              <w:t>Pretty good I think</w:t>
+            </w:r>
+          </w:p>
+          <w:p>
+            <w:pPr>
+              <w:pStyle w:val="Body A"/>
+              <w:widowControl w:val="0"/>
+              <w:spacing w:line="240" w:lineRule="auto"/>
+              <w:rPr>
+                <w:lang w:val="en-US"/>
+              </w:rPr>
+            </w:pPr>
+          </w:p>
+          <w:p>
+            <w:pPr>
+              <w:pStyle w:val="Body A"/>
+              <w:widowControl w:val="0"/>
+              <w:spacing w:line="240" w:lineRule="auto"/>
+            </w:pPr>
+            <w:r>
+              <w:rPr>
+                <w:b w:val="1"/>
+                <w:bCs w:val="1"/>
+                <w:rtl w:val="0"/>
+                <w:lang w:val="en-US"/>
+              </w:rPr>
+              <w:t xml:space="preserve">Dalin </w:t>
+            </w:r>
+            <w:r>
+              <w:rPr>
+                <w:rStyle w:val="None"/>
+                <w:b w:val="0"/>
+                <w:bCs w:val="0"/>
+                <w:rtl w:val="0"/>
+                <w:lang w:val="en-US"/>
+              </w:rPr>
+              <w:t>- Josh helped encourage me to not drop out of school. I already have a degree and am applying to a job that I think I might get. It</w:t>
+            </w:r>
+            <w:r>
+              <w:rPr>
+                <w:rStyle w:val="None"/>
+                <w:b w:val="0"/>
+                <w:bCs w:val="0"/>
+                <w:rtl w:val="0"/>
+                <w:lang w:val="en-US"/>
+              </w:rPr>
+              <w:t>’</w:t>
+            </w:r>
+            <w:r>
+              <w:rPr>
+                <w:rStyle w:val="None"/>
+                <w:b w:val="0"/>
+                <w:bCs w:val="0"/>
+                <w:rtl w:val="0"/>
+                <w:lang w:val="en-US"/>
+              </w:rPr>
+              <w:t>s hard for me to see the value in getting a degree when it is not a core piece of the interview. I</w:t>
+            </w:r>
+            <w:r>
+              <w:rPr>
+                <w:rStyle w:val="None"/>
+                <w:b w:val="0"/>
+                <w:bCs w:val="0"/>
+                <w:rtl w:val="0"/>
+                <w:lang w:val="en-US"/>
+              </w:rPr>
+              <w:t>’</w:t>
+            </w:r>
+            <w:r>
+              <w:rPr>
+                <w:rStyle w:val="None"/>
+                <w:b w:val="0"/>
+                <w:bCs w:val="0"/>
+                <w:rtl w:val="0"/>
+                <w:lang w:val="en-US"/>
+              </w:rPr>
+              <w:t>ve been learning the most outside of school anyways</w:t>
             </w:r>
           </w:p>
         </w:tc>
@@ -1821,7 +1620,7 @@
           <w:shd w:val="clear" w:color="auto" w:fill="ced7e7"/>
         </w:tblPrEx>
         <w:trPr>
-          <w:trHeight w:val="1373" w:hRule="atLeast"/>
+          <w:trHeight w:val="1393" w:hRule="atLeast"/>
         </w:trPr>
         <w:tc>
           <w:tcPr>
@@ -1843,12 +1642,13 @@
           </w:tcPr>
           <w:p>
             <w:pPr>
-              <w:pStyle w:val="Body"/>
+              <w:pStyle w:val="Body A"/>
               <w:widowControl w:val="0"/>
               <w:spacing w:line="240" w:lineRule="auto"/>
             </w:pPr>
             <w:r>
               <w:rPr>
+                <w:rStyle w:val="None"/>
                 <w:shd w:val="nil" w:color="auto" w:fill="auto"/>
                 <w:rtl w:val="0"/>
                 <w:lang w:val="en-US"/>
@@ -1877,113 +1677,17 @@
           </w:tcPr>
           <w:p>
             <w:pPr>
-              <w:pStyle w:val="Body"/>
+              <w:pStyle w:val="Body A"/>
               <w:widowControl w:val="0"/>
               <w:spacing w:line="240" w:lineRule="auto"/>
-              <w:rPr>
-                <w:b w:val="1"/>
-                <w:bCs w:val="1"/>
-                <w:sz w:val="20"/>
-                <w:szCs w:val="20"/>
-                <w:shd w:val="nil" w:color="auto" w:fill="auto"/>
-                <w:lang w:val="en-US"/>
-                <w14:textOutline w14:w="12700" w14:cap="flat">
-                  <w14:noFill/>
-                  <w14:miter w14:lim="400000"/>
-                </w14:textOutline>
-              </w:rPr>
-            </w:pPr>
-            <w:r>
-              <w:rPr>
-                <w:shd w:val="nil" w:color="auto" w:fill="auto"/>
-                <w:rtl w:val="0"/>
-                <w:lang w:val="en-US"/>
-              </w:rPr>
-              <w:t>I</w:t>
-            </w:r>
-            <w:r>
-              <w:rPr>
-                <w:shd w:val="nil" w:color="auto" w:fill="auto"/>
-                <w:rtl w:val="0"/>
-                <w:lang w:val="en-US"/>
-              </w:rPr>
-              <w:t>’</w:t>
-            </w:r>
-            <w:r>
-              <w:rPr>
-                <w:shd w:val="nil" w:color="auto" w:fill="auto"/>
-                <w:rtl w:val="0"/>
-                <w:lang w:val="en-US"/>
-              </w:rPr>
-              <w:t xml:space="preserve">m not sure how we are wanting to put it on the internet yet but </w:t>
-            </w:r>
-            <w:r>
-              <w:rPr>
-                <w:b w:val="1"/>
-                <w:bCs w:val="1"/>
-                <w:sz w:val="20"/>
-                <w:szCs w:val="20"/>
-                <w:shd w:val="nil" w:color="auto" w:fill="auto"/>
-                <w:rtl w:val="0"/>
-                <w:lang w:val="en-US"/>
-                <w14:textOutline w14:w="12700" w14:cap="flat">
-                  <w14:noFill/>
-                  <w14:miter w14:lim="400000"/>
-                </w14:textOutline>
-              </w:rPr>
-              <w:t>Dalin is going to help me understand that.</w:t>
-            </w:r>
-            <w:r>
-              <w:rPr>
-                <w:b w:val="1"/>
-                <w:bCs w:val="1"/>
-                <w:sz w:val="20"/>
-                <w:szCs w:val="20"/>
-                <w:shd w:val="nil" w:color="auto" w:fill="auto"/>
-                <w:rtl w:val="0"/>
-                <w:lang w:val="en-US"/>
-                <w14:textOutline w14:w="12700" w14:cap="flat">
-                  <w14:noFill/>
-                  <w14:miter w14:lim="400000"/>
-                </w14:textOutline>
-              </w:rPr>
-              <w:t xml:space="preserve"> </w:t>
-            </w:r>
-          </w:p>
-          <w:p>
-            <w:pPr>
-              <w:pStyle w:val="Body"/>
-              <w:widowControl w:val="0"/>
-              <w:spacing w:line="240" w:lineRule="auto"/>
-            </w:pPr>
-            <w:r>
-              <w:rPr>
-                <w:b w:val="1"/>
-                <w:bCs w:val="1"/>
-                <w:sz w:val="20"/>
-                <w:szCs w:val="20"/>
-                <w:shd w:val="nil" w:color="auto" w:fill="auto"/>
-                <w:rtl w:val="0"/>
-                <w:lang w:val="en-US"/>
-                <w14:textOutline w14:w="12700" w14:cap="flat">
-                  <w14:noFill/>
-                  <w14:miter w14:lim="400000"/>
-                </w14:textOutline>
-              </w:rPr>
-              <w:t xml:space="preserve">Dalin - </w:t>
-            </w:r>
-            <w:r>
-              <w:rPr>
-                <w:sz w:val="20"/>
-                <w:szCs w:val="20"/>
-                <w:rtl w:val="0"/>
-                <w:lang w:val="en-US"/>
-                <w14:textOutline w14:w="12700" w14:cap="flat">
-                  <w14:noFill/>
-                  <w14:miter w14:lim="400000"/>
-                </w14:textOutline>
-              </w:rPr>
-              <w:t>I bought a domain for our project and configured it with Github Pages, so now it is accessible from anywhere on the internet for the next two years</w:t>
+            </w:pPr>
+            <w:r>
+              <w:rPr>
+                <w:rFonts w:ascii="Arial" w:hAnsi="Arial"/>
+                <w:rtl w:val="0"/>
+                <w:lang w:val="en-US"/>
+              </w:rPr>
+              <w:t>Currently nothing, just need to make sure we meet all of the requirements!</w:t>
             </w:r>
           </w:p>
         </w:tc>
@@ -1993,7 +1697,7 @@
           <w:shd w:val="clear" w:color="auto" w:fill="ced7e7"/>
         </w:tblPrEx>
         <w:trPr>
-          <w:trHeight w:val="493" w:hRule="atLeast"/>
+          <w:trHeight w:val="1693" w:hRule="atLeast"/>
         </w:trPr>
         <w:tc>
           <w:tcPr>
@@ -2015,12 +1719,13 @@
           </w:tcPr>
           <w:p>
             <w:pPr>
-              <w:pStyle w:val="Body"/>
+              <w:pStyle w:val="Body A"/>
               <w:widowControl w:val="0"/>
               <w:spacing w:line="240" w:lineRule="auto"/>
             </w:pPr>
             <w:r>
               <w:rPr>
+                <w:rStyle w:val="None"/>
                 <w:shd w:val="nil" w:color="auto" w:fill="auto"/>
                 <w:rtl w:val="0"/>
                 <w:lang w:val="en-US"/>
@@ -2049,17 +1754,55 @@
           </w:tcPr>
           <w:p>
             <w:pPr>
-              <w:pStyle w:val="Body"/>
+              <w:pStyle w:val="Body A"/>
               <w:widowControl w:val="0"/>
               <w:spacing w:line="240" w:lineRule="auto"/>
-            </w:pPr>
-            <w:r>
-              <w:rPr>
-                <w:shd w:val="nil" w:color="auto" w:fill="auto"/>
-                <w:rtl w:val="0"/>
-                <w:lang w:val="en-US"/>
-              </w:rPr>
-              <w:t>I want to finish the css and get done some of the java script was well as import the api we will be using.</w:t>
+              <w:rPr>
+                <w:lang w:val="en-US"/>
+              </w:rPr>
+            </w:pPr>
+            <w:r>
+              <w:rPr>
+                <w:rtl w:val="0"/>
+                <w:lang w:val="en-US"/>
+              </w:rPr>
+              <w:t>We have the API, we have the HTML, and the CSS. I think we need to work on some of the styling to make it look more modern and then we just have a few more details to work.</w:t>
+            </w:r>
+          </w:p>
+          <w:p>
+            <w:pPr>
+              <w:pStyle w:val="Body A"/>
+              <w:widowControl w:val="0"/>
+              <w:spacing w:line="240" w:lineRule="auto"/>
+              <w:rPr>
+                <w:lang w:val="en-US"/>
+              </w:rPr>
+            </w:pPr>
+          </w:p>
+          <w:p>
+            <w:pPr>
+              <w:pStyle w:val="Body A"/>
+              <w:widowControl w:val="0"/>
+              <w:spacing w:line="240" w:lineRule="auto"/>
+            </w:pPr>
+            <w:r>
+              <w:rPr>
+                <w:b w:val="1"/>
+                <w:bCs w:val="1"/>
+                <w:rtl w:val="0"/>
+                <w:lang w:val="en-US"/>
+              </w:rPr>
+              <w:t xml:space="preserve">Dalin </w:t>
+            </w:r>
+            <w:r>
+              <w:rPr>
+                <w:rStyle w:val="None"/>
+                <w:b w:val="0"/>
+                <w:bCs w:val="0"/>
+                <w:rtl w:val="0"/>
+                <w:lang w:val="en-US"/>
+              </w:rPr>
+              <w:t>- I want to work on the graph creation module so that we can display that</w:t>
             </w:r>
           </w:p>
         </w:tc>
@@ -2067,9 +1810,10 @@
     </w:tbl>
     <w:p>
       <w:pPr>
-        <w:pStyle w:val="Body"/>
+        <w:pStyle w:val="Body A"/>
         <w:widowControl w:val="0"/>
         <w:spacing w:before="200" w:after="200" w:line="240" w:lineRule="auto"/>
+        <w:ind w:left="108" w:hanging="108"/>
       </w:pPr>
       <w:r/>
     </w:p>
@@ -2090,7 +1834,6 @@
   <w:p>
     <w:pPr>
       <w:pStyle w:val="Header &amp; Footer"/>
-      <w:bidi w:val="0"/>
     </w:pPr>
     <w:r/>
   </w:p>
@@ -2102,7 +1845,6 @@
   <w:p>
     <w:pPr>
       <w:pStyle w:val="Header &amp; Footer"/>
-      <w:bidi w:val="0"/>
     </w:pPr>
     <w:r>
       <mc:AlternateContent>
@@ -2310,11 +2052,12 @@
       <w:position w:val="0"/>
       <w:sz w:val="24"/>
       <w:szCs w:val="24"/>
-      <w:u w:val="none"/>
+      <w:u w:val="none" w:color="000000"/>
       <w:shd w:val="nil" w:color="auto" w:fill="auto"/>
       <w:vertAlign w:val="baseline"/>
-      <w14:textOutline>
+      <w14:textOutline w14:w="12700" w14:cap="flat">
         <w14:noFill/>
+        <w14:miter w14:lim="400000"/>
       </w14:textOutline>
       <w14:textFill>
         <w14:solidFill>
@@ -2325,7 +2068,7 @@
   </w:style>
   <w:style w:type="paragraph" w:styleId="Title">
     <w:name w:val="Title"/>
-    <w:next w:val="Body"/>
+    <w:next w:val="Body A"/>
     <w:pPr>
       <w:keepNext w:val="1"/>
       <w:keepLines w:val="1"/>
@@ -2360,8 +2103,9 @@
       <w:shd w:val="nil" w:color="auto" w:fill="auto"/>
       <w:vertAlign w:val="baseline"/>
       <w:lang w:val="en-US"/>
-      <w14:textOutline>
+      <w14:textOutline w14:w="12700" w14:cap="flat">
         <w14:noFill/>
+        <w14:miter w14:lim="400000"/>
       </w14:textOutline>
       <w14:textFill>
         <w14:solidFill>
@@ -2370,9 +2114,9 @@
       </w14:textFill>
     </w:rPr>
   </w:style>
-  <w:style w:type="paragraph" w:styleId="Body">
-    <w:name w:val="Body"/>
-    <w:next w:val="Body"/>
+  <w:style w:type="paragraph" w:styleId="Body A">
+    <w:name w:val="Body A"/>
+    <w:next w:val="Body A"/>
     <w:pPr>
       <w:keepNext w:val="0"/>
       <w:keepLines w:val="0"/>
@@ -2406,8 +2150,9 @@
       <w:u w:val="none" w:color="000000"/>
       <w:shd w:val="nil" w:color="auto" w:fill="auto"/>
       <w:vertAlign w:val="baseline"/>
-      <w14:textOutline>
+      <w14:textOutline w14:w="12700" w14:cap="flat">
         <w14:noFill/>
+        <w14:miter w14:lim="400000"/>
       </w14:textOutline>
       <w14:textFill>
         <w14:solidFill>
@@ -2418,7 +2163,7 @@
   </w:style>
   <w:style w:type="paragraph" w:styleId="Heading">
     <w:name w:val="Heading"/>
-    <w:next w:val="Body"/>
+    <w:next w:val="Body A"/>
     <w:pPr>
       <w:keepNext w:val="1"/>
       <w:keepLines w:val="1"/>
@@ -2452,6 +2197,73 @@
       <w:u w:val="none" w:color="000000"/>
       <w:shd w:val="nil" w:color="auto" w:fill="auto"/>
       <w:vertAlign w:val="baseline"/>
+      <w14:textOutline w14:w="12700" w14:cap="flat">
+        <w14:noFill/>
+        <w14:miter w14:lim="400000"/>
+      </w14:textOutline>
+      <w14:textFill>
+        <w14:solidFill>
+          <w14:srgbClr w14:val="000000"/>
+        </w14:solidFill>
+      </w14:textFill>
+    </w:rPr>
+  </w:style>
+  <w:style w:type="character" w:styleId="None">
+    <w:name w:val="None"/>
+  </w:style>
+  <w:style w:type="character" w:styleId="Hyperlink.0">
+    <w:name w:val="Hyperlink.0"/>
+    <w:basedOn w:val="None"/>
+    <w:next w:val="Hyperlink.0"/>
+    <w:rPr>
+      <w:outline w:val="0"/>
+      <w:color w:val="0000ff"/>
+      <w:u w:val="single" w:color="0000ff"/>
+      <w:shd w:val="nil" w:color="auto" w:fill="auto"/>
+      <w:lang w:val="de-DE"/>
+      <w14:textFill>
+        <w14:solidFill>
+          <w14:srgbClr w14:val="0000FF"/>
+        </w14:solidFill>
+      </w14:textFill>
+    </w:rPr>
+  </w:style>
+  <w:style w:type="paragraph" w:styleId="Body">
+    <w:name w:val="Body"/>
+    <w:next w:val="Body"/>
+    <w:pPr>
+      <w:keepNext w:val="0"/>
+      <w:keepLines w:val="0"/>
+      <w:pageBreakBefore w:val="0"/>
+      <w:widowControl w:val="1"/>
+      <w:shd w:val="clear" w:color="auto" w:fill="auto"/>
+      <w:suppressAutoHyphens w:val="0"/>
+      <w:bidi w:val="0"/>
+      <w:spacing w:before="0" w:after="0" w:line="240" w:lineRule="auto"/>
+      <w:ind w:left="0" w:right="0" w:firstLine="0"/>
+      <w:jc w:val="left"/>
+      <w:outlineLvl w:val="9"/>
+    </w:pPr>
+    <w:rPr>
+      <w:rFonts w:ascii="Times New Roman" w:cs="Times New Roman" w:hAnsi="Times New Roman" w:eastAsia="Times New Roman"/>
+      <w:b w:val="0"/>
+      <w:bCs w:val="0"/>
+      <w:i w:val="0"/>
+      <w:iCs w:val="0"/>
+      <w:caps w:val="0"/>
+      <w:smallCaps w:val="0"/>
+      <w:strike w:val="0"/>
+      <w:dstrike w:val="0"/>
+      <w:outline w:val="0"/>
+      <w:color w:val="000000"/>
+      <w:spacing w:val="0"/>
+      <w:kern w:val="0"/>
+      <w:position w:val="0"/>
+      <w:sz w:val="24"/>
+      <w:szCs w:val="24"/>
+      <w:u w:val="none" w:color="000000"/>
+      <w:shd w:val="nil" w:color="auto" w:fill="auto"/>
+      <w:vertAlign w:val="baseline"/>
       <w14:textOutline>
         <w14:noFill/>
       </w14:textOutline>
@@ -2462,14 +2274,23 @@
       </w14:textFill>
     </w:rPr>
   </w:style>
-  <w:style w:type="character" w:styleId="Hyperlink.0">
-    <w:name w:val="Hyperlink.0"/>
-    <w:basedOn w:val="Hyperlink"/>
-    <w:next w:val="Hyperlink.0"/>
+  <w:style w:type="character" w:styleId="Hyperlink.1">
+    <w:name w:val="Hyperlink.1"/>
+    <w:basedOn w:val="None"/>
+    <w:next w:val="Hyperlink.1"/>
     <w:rPr>
+      <w:rFonts w:ascii="Arial" w:cs="Arial" w:hAnsi="Arial" w:eastAsia="Arial"/>
       <w:outline w:val="0"/>
       <w:color w:val="0000ff"/>
+      <w:sz w:val="22"/>
+      <w:szCs w:val="22"/>
       <w:u w:val="single" w:color="0000ff"/>
+      <w:shd w:val="nil" w:color="auto" w:fill="auto"/>
+      <w:lang w:val="en-US"/>
+      <w14:textOutline w14:w="12700" w14:cap="flat">
+        <w14:noFill/>
+        <w14:miter w14:lim="400000"/>
+      </w14:textOutline>
       <w14:textFill>
         <w14:solidFill>
           <w14:srgbClr w14:val="0000FF"/>
@@ -2625,9 +2446,9 @@
         </a:effectStyle>
         <a:effectStyle>
           <a:effectLst>
-            <a:outerShdw sx="100000" sy="100000" kx="0" ky="0" algn="b" rotWithShape="0" blurRad="38100" dist="20000" dir="5400000">
+            <a:outerShdw sx="100000" sy="100000" kx="0" ky="0" algn="b" rotWithShape="0" blurRad="38100" dist="23000" dir="5400000">
               <a:srgbClr val="000000">
-                <a:alpha val="38000"/>
+                <a:alpha val="35000"/>
               </a:srgbClr>
             </a:outerShdw>
           </a:effectLst>
@@ -2707,7 +2528,7 @@
         </a:effectLst>
         <a:sp3d/>
       </a:spPr>
-      <a:bodyPr rot="0" spcFirstLastPara="1" vertOverflow="overflow" horzOverflow="overflow" vert="horz" wrap="square" lIns="45719" tIns="45719" rIns="45719" bIns="45719" numCol="1" spcCol="38100" rtlCol="0" anchor="ctr" upright="0">
+      <a:bodyPr rot="0" spcFirstLastPara="1" vertOverflow="overflow" horzOverflow="overflow" vert="horz" wrap="square" lIns="45718" tIns="45718" rIns="45718" bIns="45718" numCol="1" spcCol="38100" rtlCol="0" anchor="ctr" upright="0">
         <a:spAutoFit/>
       </a:bodyPr>
       <a:lstStyle>
@@ -2735,10 +2556,10 @@
             </a:solidFill>
             <a:effectLst/>
             <a:uFillTx/>
-            <a:latin typeface="Cambria"/>
-            <a:ea typeface="Cambria"/>
-            <a:cs typeface="Cambria"/>
-            <a:sym typeface="Cambria"/>
+            <a:latin typeface="+mn-lt"/>
+            <a:ea typeface="+mn-ea"/>
+            <a:cs typeface="+mn-cs"/>
+            <a:sym typeface="Helvetica Neue"/>
           </a:defRPr>
         </a:defPPr>
         <a:lvl1pPr marL="0" marR="0" indent="0" algn="l" defTabSz="914400" rtl="0" fontAlgn="auto" latinLnBrk="1" hangingPunct="0">
@@ -2994,9 +2815,9 @@
           <a:round/>
         </a:ln>
         <a:effectLst>
-          <a:outerShdw sx="100000" sy="100000" kx="0" ky="0" algn="b" rotWithShape="0" blurRad="38100" dist="20000" dir="5400000">
+          <a:outerShdw sx="100000" sy="100000" kx="0" ky="0" algn="b" rotWithShape="0" blurRad="38100" dist="23000" dir="5400000">
             <a:srgbClr val="000000">
-              <a:alpha val="38000"/>
+              <a:alpha val="35000"/>
             </a:srgbClr>
           </a:outerShdw>
         </a:effectLst>
@@ -3284,7 +3105,7 @@
         <a:effectLst/>
         <a:sp3d/>
       </a:spPr>
-      <a:bodyPr rot="0" spcFirstLastPara="1" vertOverflow="overflow" horzOverflow="overflow" vert="horz" wrap="square" lIns="45719" tIns="45719" rIns="45719" bIns="45719" numCol="1" spcCol="38100" rtlCol="0" anchor="t" upright="0">
+      <a:bodyPr rot="0" spcFirstLastPara="1" vertOverflow="overflow" horzOverflow="overflow" vert="horz" wrap="square" lIns="45718" tIns="45718" rIns="45718" bIns="45718" numCol="1" spcCol="38100" rtlCol="0" anchor="t" upright="0">
         <a:spAutoFit/>
       </a:bodyPr>
       <a:lstStyle>
@@ -3312,10 +3133,10 @@
             </a:solidFill>
             <a:effectLst/>
             <a:uFillTx/>
-            <a:latin typeface="Cambria"/>
-            <a:ea typeface="Cambria"/>
-            <a:cs typeface="Cambria"/>
-            <a:sym typeface="Cambria"/>
+            <a:latin typeface="+mn-lt"/>
+            <a:ea typeface="+mn-ea"/>
+            <a:cs typeface="+mn-cs"/>
+            <a:sym typeface="Helvetica Neue"/>
           </a:defRPr>
         </a:defPPr>
         <a:lvl1pPr marL="0" marR="0" indent="0" algn="l" defTabSz="914400" rtl="0" fontAlgn="auto" latinLnBrk="1" hangingPunct="0">

</xml_diff>